<commit_message>
docs: record production acceptance and independent interface review
</commit_message>
<xml_diff>
--- a/docs/structured-protocol/20261014/evidence/protocol.docx
+++ b/docs/structured-protocol/20261014/evidence/protocol.docx
@@ -13,7 +13,7 @@
           <w:rFonts w:ascii="Times New Roman" w:hAnsi="Times New Roman" w:eastAsia="SimSun"/>
           <w:b/>
         </w:rPr>
-        <w:t>SYN-b9e2edc6-3b62-4995-b77d-4c0d11eccccd</w:t>
+        <w:t>SYN-79b5ab5c-dbd4-464b-a250-d996a01b0b48</w:t>
       </w:r>
     </w:p>
     <w:p>
@@ -105,7 +105,7 @@
               <w:rPr>
                 <w:rFonts w:ascii="Times New Roman" w:hAnsi="Times New Roman" w:eastAsia="SimSun"/>
               </w:rPr>
-              <w:t>SYN-b9e2edc6-3b62-4995-b77d-4c0d11eccccd 350／600 µL 合成规程</w:t>
+              <w:t>SYN-79b5ab5c-dbd4-464b-a250-d996a01b0b48 350／600 µL 合成规程</w:t>
             </w:r>
           </w:p>
         </w:tc>
@@ -1231,6 +1231,150 @@
         <w:t>70 · 代表性长正文用于验证中文输入、选择、保存与滚动位置。记录来源和单位，保留实验实际操作与原始数据的关联。</w:t>
       </w:r>
     </w:p>
+    <w:tbl>
+      <w:tblPr>
+        <w:tblW w:w="9576" w:type="dxa"/>
+        <w:tblInd w:w="120" w:type="dxa"/>
+        <w:tblBorders>
+          <w:top w:val="single" w:sz="12" w:color="666666" w:space="0"/>
+          <w:left w:val="none" w:sz="0" w:color="auto" w:space="0"/>
+          <w:bottom w:val="single" w:sz="12" w:color="666666" w:space="0"/>
+          <w:right w:val="none" w:sz="0" w:color="auto" w:space="0"/>
+          <w:insideH w:val="none" w:sz="0" w:color="auto" w:space="0"/>
+          <w:insideV w:val="none" w:sz="0" w:color="auto" w:space="0"/>
+        </w:tblBorders>
+        <w:tblLayout w:type="fixed"/>
+        <w:tblCellMar>
+          <w:top w:w="0" w:type="dxa"/>
+          <w:left w:w="108" w:type="dxa"/>
+          <w:bottom w:w="0" w:type="dxa"/>
+          <w:right w:w="108" w:type="dxa"/>
+        </w:tblCellMar>
+      </w:tblPr>
+      <w:tblGrid>
+        <w:gridCol w:w="4788"/>
+        <w:gridCol w:w="4788"/>
+      </w:tblGrid>
+      <w:tr>
+        <w:trPr>
+          <w:cantSplit/>
+          <w:tblHeader/>
+        </w:trPr>
+        <w:tc>
+          <w:tcPr>
+            <w:tcW w:w="4788" w:type="dxa"/>
+            <w:tcBorders>
+              <w:bottom w:val="single" w:sz="6" w:color="666666" w:space="0"/>
+            </w:tcBorders>
+            <w:shd w:val="clear" w:color="auto" w:fill="D9D9D9"/>
+            <w:tcMar>
+              <w:top w:w="40" w:type="dxa"/>
+              <w:left w:w="120" w:type="dxa"/>
+              <w:bottom w:w="40" w:type="dxa"/>
+              <w:right w:w="120" w:type="dxa"/>
+            </w:tcMar>
+            <w:vAlign w:val="center"/>
+          </w:tcPr>
+          <w:p>
+            <w:pPr>
+              <w:spacing w:before="0" w:after="0" w:line="240" w:lineRule="auto"/>
+              <w:jc w:val="center"/>
+            </w:pPr>
+            <w:r>
+              <w:rPr>
+                <w:rFonts w:ascii="Times New Roman" w:hAnsi="Times New Roman" w:eastAsia="SimSun"/>
+                <w:b/>
+              </w:rPr>
+              <w:t>记录类型</w:t>
+            </w:r>
+          </w:p>
+        </w:tc>
+        <w:tc>
+          <w:tcPr>
+            <w:tcW w:w="4788" w:type="dxa"/>
+            <w:tcBorders>
+              <w:bottom w:val="single" w:sz="6" w:color="666666" w:space="0"/>
+            </w:tcBorders>
+            <w:shd w:val="clear" w:color="auto" w:fill="D9D9D9"/>
+            <w:tcMar>
+              <w:top w:w="40" w:type="dxa"/>
+              <w:left w:w="120" w:type="dxa"/>
+              <w:bottom w:w="40" w:type="dxa"/>
+              <w:right w:w="120" w:type="dxa"/>
+            </w:tcMar>
+            <w:vAlign w:val="center"/>
+          </w:tcPr>
+          <w:p>
+            <w:pPr>
+              <w:spacing w:before="0" w:after="0" w:line="240" w:lineRule="auto"/>
+              <w:jc w:val="center"/>
+            </w:pPr>
+            <w:r>
+              <w:rPr>
+                <w:rFonts w:ascii="Times New Roman" w:hAnsi="Times New Roman" w:eastAsia="SimSun"/>
+                <w:b/>
+              </w:rPr>
+              <w:t>说明</w:t>
+            </w:r>
+          </w:p>
+        </w:tc>
+      </w:tr>
+      <w:tr>
+        <w:trPr>
+          <w:cantSplit/>
+        </w:trPr>
+        <w:tc>
+          <w:tcPr>
+            <w:tcW w:w="4788" w:type="dxa"/>
+            <w:shd w:val="clear" w:color="auto" w:fill="FFFFFF"/>
+            <w:tcMar>
+              <w:top w:w="40" w:type="dxa"/>
+              <w:left w:w="120" w:type="dxa"/>
+              <w:bottom w:w="40" w:type="dxa"/>
+              <w:right w:w="120" w:type="dxa"/>
+            </w:tcMar>
+            <w:vAlign w:val="center"/>
+          </w:tcPr>
+          <w:p>
+            <w:pPr>
+              <w:spacing w:before="0" w:after="0" w:line="240" w:lineRule="auto"/>
+              <w:jc w:val="left"/>
+            </w:pPr>
+            <w:r>
+              <w:rPr>
+                <w:rFonts w:ascii="Times New Roman" w:hAnsi="Times New Roman" w:eastAsia="SimSun"/>
+              </w:rPr>
+              <w:t>来源</w:t>
+            </w:r>
+          </w:p>
+        </w:tc>
+        <w:tc>
+          <w:tcPr>
+            <w:tcW w:w="4788" w:type="dxa"/>
+            <w:shd w:val="clear" w:color="auto" w:fill="FFFFFF"/>
+            <w:tcMar>
+              <w:top w:w="40" w:type="dxa"/>
+              <w:left w:w="120" w:type="dxa"/>
+              <w:bottom w:w="40" w:type="dxa"/>
+              <w:right w:w="120" w:type="dxa"/>
+            </w:tcMar>
+            <w:vAlign w:val="center"/>
+          </w:tcPr>
+          <w:p>
+            <w:pPr>
+              <w:spacing w:before="0" w:after="0" w:line="240" w:lineRule="auto"/>
+              <w:jc w:val="left"/>
+            </w:pPr>
+            <w:r>
+              <w:rPr>
+                <w:rFonts w:ascii="Times New Roman" w:hAnsi="Times New Roman" w:eastAsia="SimSun"/>
+              </w:rPr>
+              <w:t>合成软件验收；非真实实验结论</w:t>
+            </w:r>
+          </w:p>
+        </w:tc>
+      </w:tr>
+    </w:tbl>
     <w:p>
       <w:pPr>
         <w:pStyle w:val="SectionHeading"/>
@@ -1608,7 +1752,7 @@
         <w:drawing>
           <wp:inline xmlns:wp="http://schemas.openxmlformats.org/drawingml/2006/wordprocessingDrawing" xmlns:a="http://schemas.openxmlformats.org/drawingml/2006/main" xmlns:pic="http://schemas.openxmlformats.org/drawingml/2006/picture">
             <wp:extent cx="4256532" cy="1276960"/>
-            <wp:docPr id="1" name="Image 1" descr="labnest-media:{&quot;caption&quot;:&quot;中文图注 1 · 合成验收&quot;,&quot;filename&quot;:&quot;合成图片1.png&quot;,&quot;widthPercent&quot;:70,&quot;attachmentId&quot;:&quot;cmv7g3c4z0002w6os3s2voue9&quot;}"/>
+            <wp:docPr id="1" name="Image 1" descr="labnest-media:{&quot;caption&quot;:&quot;中文图注 1 · 合成验收&quot;,&quot;filename&quot;:&quot;合成图片1.png&quot;,&quot;widthPercent&quot;:70,&quot;attachmentId&quot;:&quot;cmv7gz2cy00028fostiqgxiug&quot;}"/>
             <wp:cNvGraphicFramePr>
               <a:graphicFrameLocks noChangeAspect="1"/>
             </wp:cNvGraphicFramePr>
@@ -1661,7 +1805,7 @@
         <w:drawing>
           <wp:inline xmlns:wp="http://schemas.openxmlformats.org/drawingml/2006/wordprocessingDrawing" xmlns:a="http://schemas.openxmlformats.org/drawingml/2006/main" xmlns:pic="http://schemas.openxmlformats.org/drawingml/2006/picture">
             <wp:extent cx="4256532" cy="1276960"/>
-            <wp:docPr id="2" name="Image 2" descr="labnest-media:{&quot;caption&quot;:&quot;中文图注 2 · 合成验收&quot;,&quot;filename&quot;:&quot;合成图片2.png&quot;,&quot;widthPercent&quot;:70,&quot;attachmentId&quot;:&quot;cmv7g3c7l0003w6osloz24g4k&quot;}"/>
+            <wp:docPr id="2" name="Image 2" descr="labnest-media:{&quot;caption&quot;:&quot;中文图注 2 · 合成验收&quot;,&quot;filename&quot;:&quot;合成图片2.png&quot;,&quot;widthPercent&quot;:70,&quot;attachmentId&quot;:&quot;cmv7gz2fp00038fosd6vpkxt6&quot;}"/>
             <wp:cNvGraphicFramePr>
               <a:graphicFrameLocks noChangeAspect="1"/>
             </wp:cNvGraphicFramePr>
@@ -1714,7 +1858,7 @@
         <w:drawing>
           <wp:inline xmlns:wp="http://schemas.openxmlformats.org/drawingml/2006/wordprocessingDrawing" xmlns:a="http://schemas.openxmlformats.org/drawingml/2006/main" xmlns:pic="http://schemas.openxmlformats.org/drawingml/2006/picture">
             <wp:extent cx="4256532" cy="1276960"/>
-            <wp:docPr id="3" name="Image 3" descr="labnest-media:{&quot;caption&quot;:&quot;中文图注 3 · 合成验收&quot;,&quot;filename&quot;:&quot;合成图片3.png&quot;,&quot;widthPercent&quot;:70,&quot;attachmentId&quot;:&quot;cmv7g3ca00004w6osmm64bwru&quot;}"/>
+            <wp:docPr id="3" name="Image 3" descr="labnest-media:{&quot;caption&quot;:&quot;中文图注 3 · 合成验收&quot;,&quot;filename&quot;:&quot;合成图片3.png&quot;,&quot;widthPercent&quot;:70,&quot;attachmentId&quot;:&quot;cmv7gz2id00048fosxrtqpkuj&quot;}"/>
             <wp:cNvGraphicFramePr>
               <a:graphicFrameLocks noChangeAspect="1"/>
             </wp:cNvGraphicFramePr>
@@ -1767,7 +1911,7 @@
         <w:drawing>
           <wp:inline xmlns:wp="http://schemas.openxmlformats.org/drawingml/2006/wordprocessingDrawing" xmlns:a="http://schemas.openxmlformats.org/drawingml/2006/main" xmlns:pic="http://schemas.openxmlformats.org/drawingml/2006/picture">
             <wp:extent cx="4256532" cy="1276960"/>
-            <wp:docPr id="4" name="Image 4" descr="labnest-media:{&quot;caption&quot;:&quot;中文图注 4 · 合成验收&quot;,&quot;filename&quot;:&quot;合成图片4.png&quot;,&quot;widthPercent&quot;:70,&quot;attachmentId&quot;:&quot;cmv7g3cce0005w6osb116rrbv&quot;}"/>
+            <wp:docPr id="4" name="Image 4" descr="labnest-media:{&quot;caption&quot;:&quot;中文图注 4 · 合成验收&quot;,&quot;filename&quot;:&quot;合成图片4.png&quot;,&quot;widthPercent&quot;:70,&quot;attachmentId&quot;:&quot;cmv7gz2ir00058foslo91s2j6&quot;}"/>
             <wp:cNvGraphicFramePr>
               <a:graphicFrameLocks noChangeAspect="1"/>
             </wp:cNvGraphicFramePr>
@@ -2012,7 +2156,7 @@
         <w:sz w:val="16"/>
         <w:szCs w:val="16"/>
       </w:rPr>
-      <w:t>SYN-b9e2edc6-3b62-4995-b77d-4c0d11eccccd | 350／600 µL 合成规程</w:t>
+      <w:t>SYN-79b5ab5c-dbd4-464b-a250-d996a01b0b48 | 350／600 µL 合成规程</w:t>
     </w:r>
     <w:r>
       <w:tab/>

</xml_diff>

<commit_message>
docs: attach final release-container and cross-timezone evidence
</commit_message>
<xml_diff>
--- a/docs/structured-protocol/20261014/evidence/protocol.docx
+++ b/docs/structured-protocol/20261014/evidence/protocol.docx
@@ -13,7 +13,7 @@
           <w:rFonts w:ascii="Times New Roman" w:hAnsi="Times New Roman" w:eastAsia="SimSun"/>
           <w:b/>
         </w:rPr>
-        <w:t>SYN-79b5ab5c-dbd4-464b-a250-d996a01b0b48</w:t>
+        <w:t>SYN-88d664d2-3767-48f0-a72d-454ea4e871cc</w:t>
       </w:r>
     </w:p>
     <w:p>
@@ -105,7 +105,7 @@
               <w:rPr>
                 <w:rFonts w:ascii="Times New Roman" w:hAnsi="Times New Roman" w:eastAsia="SimSun"/>
               </w:rPr>
-              <w:t>SYN-79b5ab5c-dbd4-464b-a250-d996a01b0b48 350／600 µL 合成规程</w:t>
+              <w:t>SYN-88d664d2-3767-48f0-a72d-454ea4e871cc 350／600 µL 合成规程</w:t>
             </w:r>
           </w:p>
         </w:tc>
@@ -1752,7 +1752,7 @@
         <w:drawing>
           <wp:inline xmlns:wp="http://schemas.openxmlformats.org/drawingml/2006/wordprocessingDrawing" xmlns:a="http://schemas.openxmlformats.org/drawingml/2006/main" xmlns:pic="http://schemas.openxmlformats.org/drawingml/2006/picture">
             <wp:extent cx="4256532" cy="1276960"/>
-            <wp:docPr id="1" name="Image 1" descr="labnest-media:{&quot;caption&quot;:&quot;中文图注 1 · 合成验收&quot;,&quot;filename&quot;:&quot;合成图片1.png&quot;,&quot;widthPercent&quot;:70,&quot;attachmentId&quot;:&quot;cmv7gz2cy00028fostiqgxiug&quot;}"/>
+            <wp:docPr id="1" name="Image 1" descr="labnest-media:{&quot;caption&quot;:&quot;中文图注 1 · 合成验收&quot;,&quot;filename&quot;:&quot;合成图片1.png&quot;,&quot;widthPercent&quot;:70,&quot;attachmentId&quot;:&quot;cmv7hc2ye0002doosg7vg6bvz&quot;}"/>
             <wp:cNvGraphicFramePr>
               <a:graphicFrameLocks noChangeAspect="1"/>
             </wp:cNvGraphicFramePr>
@@ -1805,7 +1805,7 @@
         <w:drawing>
           <wp:inline xmlns:wp="http://schemas.openxmlformats.org/drawingml/2006/wordprocessingDrawing" xmlns:a="http://schemas.openxmlformats.org/drawingml/2006/main" xmlns:pic="http://schemas.openxmlformats.org/drawingml/2006/picture">
             <wp:extent cx="4256532" cy="1276960"/>
-            <wp:docPr id="2" name="Image 2" descr="labnest-media:{&quot;caption&quot;:&quot;中文图注 2 · 合成验收&quot;,&quot;filename&quot;:&quot;合成图片2.png&quot;,&quot;widthPercent&quot;:70,&quot;attachmentId&quot;:&quot;cmv7gz2fp00038fosd6vpkxt6&quot;}"/>
+            <wp:docPr id="2" name="Image 2" descr="labnest-media:{&quot;caption&quot;:&quot;中文图注 2 · 合成验收&quot;,&quot;filename&quot;:&quot;合成图片2.png&quot;,&quot;widthPercent&quot;:70,&quot;attachmentId&quot;:&quot;cmv7hc2z10003doossm20er1z&quot;}"/>
             <wp:cNvGraphicFramePr>
               <a:graphicFrameLocks noChangeAspect="1"/>
             </wp:cNvGraphicFramePr>
@@ -1858,7 +1858,7 @@
         <w:drawing>
           <wp:inline xmlns:wp="http://schemas.openxmlformats.org/drawingml/2006/wordprocessingDrawing" xmlns:a="http://schemas.openxmlformats.org/drawingml/2006/main" xmlns:pic="http://schemas.openxmlformats.org/drawingml/2006/picture">
             <wp:extent cx="4256532" cy="1276960"/>
-            <wp:docPr id="3" name="Image 3" descr="labnest-media:{&quot;caption&quot;:&quot;中文图注 3 · 合成验收&quot;,&quot;filename&quot;:&quot;合成图片3.png&quot;,&quot;widthPercent&quot;:70,&quot;attachmentId&quot;:&quot;cmv7gz2id00048fosxrtqpkuj&quot;}"/>
+            <wp:docPr id="3" name="Image 3" descr="labnest-media:{&quot;caption&quot;:&quot;中文图注 3 · 合成验收&quot;,&quot;filename&quot;:&quot;合成图片3.png&quot;,&quot;widthPercent&quot;:70,&quot;attachmentId&quot;:&quot;cmv7hc2zf0004doosg6k3cpcd&quot;}"/>
             <wp:cNvGraphicFramePr>
               <a:graphicFrameLocks noChangeAspect="1"/>
             </wp:cNvGraphicFramePr>
@@ -1911,7 +1911,7 @@
         <w:drawing>
           <wp:inline xmlns:wp="http://schemas.openxmlformats.org/drawingml/2006/wordprocessingDrawing" xmlns:a="http://schemas.openxmlformats.org/drawingml/2006/main" xmlns:pic="http://schemas.openxmlformats.org/drawingml/2006/picture">
             <wp:extent cx="4256532" cy="1276960"/>
-            <wp:docPr id="4" name="Image 4" descr="labnest-media:{&quot;caption&quot;:&quot;中文图注 4 · 合成验收&quot;,&quot;filename&quot;:&quot;合成图片4.png&quot;,&quot;widthPercent&quot;:70,&quot;attachmentId&quot;:&quot;cmv7gz2ir00058foslo91s2j6&quot;}"/>
+            <wp:docPr id="4" name="Image 4" descr="labnest-media:{&quot;caption&quot;:&quot;中文图注 4 · 合成验收&quot;,&quot;filename&quot;:&quot;合成图片4.png&quot;,&quot;widthPercent&quot;:70,&quot;attachmentId&quot;:&quot;cmv7hc31m0005dooscp5is23d&quot;}"/>
             <wp:cNvGraphicFramePr>
               <a:graphicFrameLocks noChangeAspect="1"/>
             </wp:cNvGraphicFramePr>
@@ -2156,7 +2156,7 @@
         <w:sz w:val="16"/>
         <w:szCs w:val="16"/>
       </w:rPr>
-      <w:t>SYN-79b5ab5c-dbd4-464b-a250-d996a01b0b48 | 350／600 µL 合成规程</w:t>
+      <w:t>SYN-88d664d2-3767-48f0-a72d-454ea4e871cc | 350／600 µL 合成规程</w:t>
     </w:r>
     <w:r>
       <w:tab/>

</xml_diff>

<commit_message>
docs: record final protocol follow-up acceptance and physical limits
</commit_message>
<xml_diff>
--- a/docs/structured-protocol/20261014/evidence/protocol.docx
+++ b/docs/structured-protocol/20261014/evidence/protocol.docx
@@ -13,7 +13,7 @@
           <w:rFonts w:ascii="Times New Roman" w:hAnsi="Times New Roman" w:eastAsia="SimSun"/>
           <w:b/>
         </w:rPr>
-        <w:t>SYN-88d664d2-3767-48f0-a72d-454ea4e871cc</w:t>
+        <w:t>SYN-a6dfc410-c299-44fc-b93b-652f764e1054</w:t>
       </w:r>
     </w:p>
     <w:p>
@@ -105,7 +105,7 @@
               <w:rPr>
                 <w:rFonts w:ascii="Times New Roman" w:hAnsi="Times New Roman" w:eastAsia="SimSun"/>
               </w:rPr>
-              <w:t>SYN-88d664d2-3767-48f0-a72d-454ea4e871cc 350／600 µL 合成规程</w:t>
+              <w:t>SYN-a6dfc410-c299-44fc-b93b-652f764e1054 350／600 µL 合成规程</w:t>
             </w:r>
           </w:p>
         </w:tc>
@@ -1752,7 +1752,7 @@
         <w:drawing>
           <wp:inline xmlns:wp="http://schemas.openxmlformats.org/drawingml/2006/wordprocessingDrawing" xmlns:a="http://schemas.openxmlformats.org/drawingml/2006/main" xmlns:pic="http://schemas.openxmlformats.org/drawingml/2006/picture">
             <wp:extent cx="4256532" cy="1276960"/>
-            <wp:docPr id="1" name="Image 1" descr="labnest-media:{&quot;caption&quot;:&quot;中文图注 1 · 合成验收&quot;,&quot;filename&quot;:&quot;合成图片1.png&quot;,&quot;widthPercent&quot;:70,&quot;attachmentId&quot;:&quot;cmv7hc2ye0002doosg7vg6bvz&quot;}"/>
+            <wp:docPr id="1" name="Image 1" descr="labnest-media:{&quot;caption&quot;:&quot;中文图注 1 · 合成验收&quot;,&quot;filename&quot;:&quot;合成图片1.png&quot;,&quot;widthPercent&quot;:70,&quot;attachmentId&quot;:&quot;cmv7wm0br0002b5oslainy0ij&quot;}"/>
             <wp:cNvGraphicFramePr>
               <a:graphicFrameLocks noChangeAspect="1"/>
             </wp:cNvGraphicFramePr>
@@ -1805,7 +1805,7 @@
         <w:drawing>
           <wp:inline xmlns:wp="http://schemas.openxmlformats.org/drawingml/2006/wordprocessingDrawing" xmlns:a="http://schemas.openxmlformats.org/drawingml/2006/main" xmlns:pic="http://schemas.openxmlformats.org/drawingml/2006/picture">
             <wp:extent cx="4256532" cy="1276960"/>
-            <wp:docPr id="2" name="Image 2" descr="labnest-media:{&quot;caption&quot;:&quot;中文图注 2 · 合成验收&quot;,&quot;filename&quot;:&quot;合成图片2.png&quot;,&quot;widthPercent&quot;:70,&quot;attachmentId&quot;:&quot;cmv7hc2z10003doossm20er1z&quot;}"/>
+            <wp:docPr id="2" name="Image 2" descr="labnest-media:{&quot;caption&quot;:&quot;中文图注 2 · 合成验收&quot;,&quot;filename&quot;:&quot;合成图片2.png&quot;,&quot;widthPercent&quot;:70,&quot;attachmentId&quot;:&quot;cmv7wm0ed0003b5osjav62b1n&quot;}"/>
             <wp:cNvGraphicFramePr>
               <a:graphicFrameLocks noChangeAspect="1"/>
             </wp:cNvGraphicFramePr>
@@ -1858,7 +1858,7 @@
         <w:drawing>
           <wp:inline xmlns:wp="http://schemas.openxmlformats.org/drawingml/2006/wordprocessingDrawing" xmlns:a="http://schemas.openxmlformats.org/drawingml/2006/main" xmlns:pic="http://schemas.openxmlformats.org/drawingml/2006/picture">
             <wp:extent cx="4256532" cy="1276960"/>
-            <wp:docPr id="3" name="Image 3" descr="labnest-media:{&quot;caption&quot;:&quot;中文图注 3 · 合成验收&quot;,&quot;filename&quot;:&quot;合成图片3.png&quot;,&quot;widthPercent&quot;:70,&quot;attachmentId&quot;:&quot;cmv7hc2zf0004doosg6k3cpcd&quot;}"/>
+            <wp:docPr id="3" name="Image 3" descr="labnest-media:{&quot;caption&quot;:&quot;中文图注 3 · 合成验收&quot;,&quot;filename&quot;:&quot;合成图片3.png&quot;,&quot;widthPercent&quot;:70,&quot;attachmentId&quot;:&quot;cmv7wm0es0004b5osxxtvlan6&quot;}"/>
             <wp:cNvGraphicFramePr>
               <a:graphicFrameLocks noChangeAspect="1"/>
             </wp:cNvGraphicFramePr>
@@ -1911,7 +1911,7 @@
         <w:drawing>
           <wp:inline xmlns:wp="http://schemas.openxmlformats.org/drawingml/2006/wordprocessingDrawing" xmlns:a="http://schemas.openxmlformats.org/drawingml/2006/main" xmlns:pic="http://schemas.openxmlformats.org/drawingml/2006/picture">
             <wp:extent cx="4256532" cy="1276960"/>
-            <wp:docPr id="4" name="Image 4" descr="labnest-media:{&quot;caption&quot;:&quot;中文图注 4 · 合成验收&quot;,&quot;filename&quot;:&quot;合成图片4.png&quot;,&quot;widthPercent&quot;:70,&quot;attachmentId&quot;:&quot;cmv7hc31m0005dooscp5is23d&quot;}"/>
+            <wp:docPr id="4" name="Image 4" descr="labnest-media:{&quot;caption&quot;:&quot;中文图注 4 · 合成验收&quot;,&quot;filename&quot;:&quot;合成图片4.png&quot;,&quot;widthPercent&quot;:70,&quot;attachmentId&quot;:&quot;cmv7wm0gz0005b5osggyla1wc&quot;}"/>
             <wp:cNvGraphicFramePr>
               <a:graphicFrameLocks noChangeAspect="1"/>
             </wp:cNvGraphicFramePr>
@@ -2156,7 +2156,7 @@
         <w:sz w:val="16"/>
         <w:szCs w:val="16"/>
       </w:rPr>
-      <w:t>SYN-88d664d2-3767-48f0-a72d-454ea4e871cc | 350／600 µL 合成规程</w:t>
+      <w:t>SYN-a6dfc410-c299-44fc-b93b-652f764e1054 | 350／600 µL 合成规程</w:t>
     </w:r>
     <w:r>
       <w:tab/>

</xml_diff>